<commit_message>
chore: ajuste no template GRU_Positiva
</commit_message>
<xml_diff>
--- a/modelos/templates/template_GRU_Positiva.docx
+++ b/modelos/templates/template_GRU_Positiva.docx
@@ -500,21 +500,77 @@
         <w:rPr>
           <w:rtl w:val="0"/>
         </w:rPr>
-        <w:t xml:space="preserve">Após análise processual, em atendimento ao Requerimento ([numRequerimento]) </w:t>
-      </w:r>
-      <w:r>
-        <w:rPr>
-          <w:b w:val="1"/>
-          <w:bCs w:val="1"/>
-          <w:rtl w:val="0"/>
-        </w:rPr>
-        <w:t xml:space="preserve">emitiu-se o extrato de prestações ([numExtrato]), a memória de cálculo ([numMemoria]) e a GRU ([numGuiaGRU) solicitada</w:t>
-      </w:r>
-      <w:r>
-        <w:rPr>
-          <w:rtl w:val="0"/>
-        </w:rPr>
-        <w:t xml:space="preserve"> que foram anexados ao processo, concluindo a análise técnica do processo.</w:t>
+        <w:t xml:space="preserve">Após análise processual, em atendimento ao Requerimento (</w:t>
+      </w:r>
+      <w:r>
+        <w:rPr>
+          <w:b w:val="1"/>
+          <w:bCs w:val="1"/>
+          <w:rtl w:val="0"/>
+        </w:rPr>
+        <w:t xml:space="preserve">[nupRequerimento]</w:t>
+      </w:r>
+      <w:r>
+        <w:rPr>
+          <w:rtl w:val="0"/>
+        </w:rPr>
+        <w:t xml:space="preserve">) emitiu-se o </w:t>
+      </w:r>
+      <w:r>
+        <w:rPr>
+          <w:b w:val="1"/>
+          <w:bCs w:val="1"/>
+          <w:rtl w:val="0"/>
+        </w:rPr>
+        <w:t xml:space="preserve">extrato de prestações</w:t>
+      </w:r>
+      <w:r>
+        <w:rPr>
+          <w:rtl w:val="0"/>
+        </w:rPr>
+        <w:t xml:space="preserve"> </w:t>
+      </w:r>
+      <w:r>
+        <w:rPr>
+          <w:b w:val="1"/>
+          <w:bCs w:val="1"/>
+          <w:rtl w:val="0"/>
+        </w:rPr>
+        <w:t xml:space="preserve">([nupExtrato])</w:t>
+      </w:r>
+      <w:r>
+        <w:rPr>
+          <w:rtl w:val="0"/>
+        </w:rPr>
+        <w:t xml:space="preserve">, a </w:t>
+      </w:r>
+      <w:r>
+        <w:rPr>
+          <w:b w:val="1"/>
+          <w:bCs w:val="1"/>
+          <w:rtl w:val="0"/>
+        </w:rPr>
+        <w:t xml:space="preserve">memória de cálculo ([nupMemoria])</w:t>
+      </w:r>
+      <w:r>
+        <w:rPr>
+          <w:rtl w:val="0"/>
+        </w:rPr>
+        <w:t xml:space="preserve"> e a </w:t>
+      </w:r>
+      <w:r>
+        <w:rPr>
+          <w:b w:val="1"/>
+          <w:bCs w:val="1"/>
+          <w:rtl w:val="0"/>
+        </w:rPr>
+        <w:t xml:space="preserve">GRU ([nupGuiaGRU])</w:t>
+      </w:r>
+      <w:r>
+        <w:rPr>
+          <w:rtl w:val="0"/>
+        </w:rPr>
+        <w:t xml:space="preserve"> solicitada que foram anexados ao processo, concluindo a análise técnica do processo.</w:t>
       </w:r>
     </w:p>
     <w:p>
@@ -1169,12 +1225,12 @@
           <wp:extent cx="7560000" cy="10684800"/>
           <wp:effectExtent b="0" l="0" r="0" t="0"/>
           <wp:wrapNone/>
-          <wp:docPr id="3" name="image2.jpg"/>
+          <wp:docPr id="3" name="image1.jpg"/>
           <a:graphic>
             <a:graphicData uri="http://schemas.openxmlformats.org/drawingml/2006/picture">
               <pic:pic>
                 <pic:nvPicPr>
-                  <pic:cNvPr id="0" name="image2.jpg"/>
+                  <pic:cNvPr id="0" name="image1.jpg"/>
                   <pic:cNvPicPr preferRelativeResize="0"/>
                 </pic:nvPicPr>
                 <pic:blipFill>
@@ -1287,12 +1343,12 @@
           <wp:extent cx="7560000" cy="10684800"/>
           <wp:effectExtent b="0" l="0" r="0" t="0"/>
           <wp:wrapNone/>
-          <wp:docPr id="4" name="image2.jpg"/>
+          <wp:docPr id="4" name="image1.jpg"/>
           <a:graphic>
             <a:graphicData uri="http://schemas.openxmlformats.org/drawingml/2006/picture">
               <pic:pic>
                 <pic:nvPicPr>
-                  <pic:cNvPr id="0" name="image2.jpg"/>
+                  <pic:cNvPr id="0" name="image1.jpg"/>
                   <pic:cNvPicPr preferRelativeResize="0"/>
                 </pic:nvPicPr>
                 <pic:blipFill>
@@ -1350,7 +1406,7 @@
       </w:rPr>
       <w:pict>
         <v:shape id="WordPictureWatermark1" style="position:absolute;width:396.0pt;height:414.75pt;rotation:0;z-index:-503316481;mso-position-horizontal-relative:margin;mso-position-horizontal:center;mso-position-vertical-relative:margin;mso-position-vertical:center;" alt="" type="#_x0000_t75">
-          <v:imagedata cropbottom="0f" cropleft="0f" cropright="0f" croptop="0f" r:id="rId1" o:title="image1.jpg"/>
+          <v:imagedata cropbottom="0f" cropleft="0f" cropright="0f" croptop="0f" r:id="rId1" o:title="image3.jpg"/>
         </v:shape>
       </w:pict>
     </w:r>
@@ -1360,7 +1416,7 @@
       </w:rPr>
       <w:pict>
         <v:shape id="WordPictureWatermark2" style="position:absolute;width:406.5pt;height:414.75pt;rotation:0;z-index:-503316481;mso-position-horizontal-relative:margin;mso-position-horizontal:center;mso-position-vertical-relative:margin;mso-position-vertical:center;" alt="" type="#_x0000_t75">
-          <v:imagedata cropbottom="0f" cropleft="0f" cropright="0f" croptop="0f" r:id="rId2" o:title="image3.jpg"/>
+          <v:imagedata cropbottom="0f" cropleft="0f" cropright="0f" croptop="0f" r:id="rId2" o:title="image2.jpg"/>
         </v:shape>
       </w:pict>
     </w:r>

</xml_diff>